<commit_message>
Major infrastructure upgrades to run.py
</commit_message>
<xml_diff>
--- a/docs_CUSTOMERS_PLEASE_READ__EN_NZ/iOrchid_CUSTOMER_DOCUMENTATION_MASTER.docx
+++ b/docs_CUSTOMERS_PLEASE_READ__EN_NZ/iOrchid_CUSTOMER_DOCUMENTATION_MASTER.docx
@@ -2,7 +2,92 @@
 <file path=word/document.xml><?xml version="1.0" encoding="utf-8"?>
 <w:document xmlns:wpc="http://schemas.microsoft.com/office/word/2010/wordprocessingCanvas" xmlns:cx="http://schemas.microsoft.com/office/drawing/2014/chartex" xmlns:cx1="http://schemas.microsoft.com/office/drawing/2015/9/8/chartex" xmlns:cx2="http://schemas.microsoft.com/office/drawing/2015/10/21/chartex" xmlns:cx3="http://schemas.microsoft.com/office/drawing/2016/5/9/chartex" xmlns:cx4="http://schemas.microsoft.com/office/drawing/2016/5/10/chartex" xmlns:cx5="http://schemas.microsoft.com/office/drawing/2016/5/11/chartex" xmlns:cx6="http://schemas.microsoft.com/office/drawing/2016/5/12/chartex" xmlns:cx7="http://schemas.microsoft.com/office/drawing/2016/5/13/chartex" xmlns:cx8="http://schemas.microsoft.com/office/drawing/2016/5/14/chartex" xmlns:mc="http://schemas.openxmlformats.org/markup-compatibility/2006" xmlns:m="http://schemas.openxmlformats.org/officeDocument/2006/math" xmlns:aink="http://schemas.microsoft.com/office/drawing/2016/ink" xmlns:am3d="http://schemas.microsoft.com/office/drawing/2017/model3d" xmlns:oel="http://schemas.microsoft.com/office/2019/extlst" xmlns:r="http://schemas.openxmlformats.org/officeDocument/2006/relationships" xmlns:wp14="http://schemas.microsoft.com/office/word/2010/wordprocessingDrawing" xmlns:wp="http://schemas.openxmlformats.org/drawingml/2006/wordprocessingDrawing" xmlns:wpg="http://schemas.microsoft.com/office/word/2010/wordprocessingGroup" xmlns:wpi="http://schemas.microsoft.com/office/word/2010/wordprocessingInk" xmlns:wps="http://schemas.microsoft.com/office/word/2010/wordprocessingShape" xmlns:o="urn:schemas-microsoft-com:office:office" xmlns:v="urn:schemas-microsoft-com:vml" xmlns:w10="urn:schemas-microsoft-com:office:word" xmlns:w="http://schemas.openxmlformats.org/wordprocessingml/2006/main" xmlns:w14="http://schemas.microsoft.com/office/word/2010/wordml" xmlns:w15="http://schemas.microsoft.com/office/word/2012/wordml" xmlns:w16cei="http://schemas.microsoft.com/office/word/2026/wordml/cei" xmlns:w16cex="http://schemas.microsoft.com/office/word/2018/wordml/cex" xmlns:w16cid="http://schemas.microsoft.com/office/word/2016/wordml/cid" xmlns:w16="http://schemas.microsoft.com/office/word/2018/wordml" xmlns:w16sdtdh="http://schemas.microsoft.com/office/word/2020/wordml/sdtdatahash" xmlns:w16sdtfl="http://schemas.microsoft.com/office/word/2024/wordml/sdtformatlock" xmlns:w16se="http://schemas.microsoft.com/office/word/2015/wordml/symex" xmlns:w16du="http://schemas.microsoft.com/office/word/2023/wordml/word16du" xmlns:wne="http://schemas.microsoft.com/office/word/2006/wordml" mc:Ignorable="w14 w15 w16se w16cid w16 w16cex w16sdtdh w16sdtfl w16du wp14">
   <w:body>
+    <w:p>
+      <w:r>
+        <w:t xml:space="preserve">Welcome to </w:t>
+      </w:r>
+      <w:proofErr w:type="spellStart"/>
+      <w:r>
+        <w:t>iOrchid</w:t>
+      </w:r>
+      <w:proofErr w:type="spellEnd"/>
+      <w:r>
+        <w:t xml:space="preserve"> Horticultural Management! The system is a whole customizable suite of applications and designer </w:t>
+      </w:r>
+      <w:proofErr w:type="spellStart"/>
+      <w:r>
+        <w:t xml:space="preserve">hardware </w:t>
+      </w:r>
+      <w:proofErr w:type="spellEnd"/>
+      <w:r>
+        <w:t>designed to maintain your horticultural crops at their optimal level.</w:t>
+      </w:r>
+    </w:p>
     <w:p/>
+    <w:p>
+      <w:r>
+        <w:t xml:space="preserve">This documentation will explain the usage and function of the suite in customer-friendly </w:t>
+      </w:r>
+      <w:proofErr w:type="spellStart"/>
+      <w:proofErr w:type="gramStart"/>
+      <w:r>
+        <w:t>non technical</w:t>
+      </w:r>
+      <w:proofErr w:type="spellEnd"/>
+      <w:proofErr w:type="gramEnd"/>
+      <w:r>
+        <w:t xml:space="preserve"> language. Any enquiries regarding the precision of the documentation can be made by writing to </w:t>
+      </w:r>
+      <w:hyperlink r:id="rId5" w:history="1">
+        <w:r>
+          <w:rPr>
+            <w:rStyle w:val="Hyperlink"/>
+          </w:rPr>
+          <w:t>cs@io</w:t>
+        </w:r>
+        <w:r>
+          <w:rPr>
+            <w:rStyle w:val="Hyperlink"/>
+          </w:rPr>
+          <w:t>r</w:t>
+        </w:r>
+        <w:r>
+          <w:rPr>
+            <w:rStyle w:val="Hyperlink"/>
+          </w:rPr>
+          <w:t>c.org</w:t>
+        </w:r>
+      </w:hyperlink>
+      <w:r>
+        <w:t xml:space="preserve">. </w:t>
+      </w:r>
+    </w:p>
+    <w:p/>
+    <w:p>
+      <w:r>
+        <w:t xml:space="preserve">The documentation is hosted on the World Wide Web Internet. Please visit the provided hyperlink to access the documentation. </w:t>
+      </w:r>
+      <w:hyperlink r:id="rId6" w:history="1">
+        <w:r>
+          <w:rPr>
+            <w:rStyle w:val="Hyperlink"/>
+          </w:rPr>
+          <w:t>https://docs.google.com/doc</w:t>
+        </w:r>
+        <w:r>
+          <w:rPr>
+            <w:rStyle w:val="Hyperlink"/>
+          </w:rPr>
+          <w:t>u</w:t>
+        </w:r>
+        <w:r>
+          <w:rPr>
+            <w:rStyle w:val="Hyperlink"/>
+          </w:rPr>
+          <w:t>ment/d/e/2PACX-1vQ0idMJdEOS8rrS4HB8uDeogNoC4IQTRh0owXsoUhRmF9VrKLVRLY60WIhjcYz5BKikBDIA_Iu20uta/pub</w:t>
+        </w:r>
+      </w:hyperlink>
+    </w:p>
     <w:sectPr>
       <w:pgSz w:w="12240" w:h="15840"/>
       <w:pgMar w:top="1440" w:right="1440" w:bottom="1440" w:left="1440" w:header="720" w:footer="720" w:gutter="0"/>
@@ -930,6 +1015,41 @@
       <w:spacing w:val="5"/>
     </w:rPr>
   </w:style>
+  <w:style w:type="character" w:styleId="Hyperlink">
+    <w:name w:val="Hyperlink"/>
+    <w:basedOn w:val="DefaultParagraphFont"/>
+    <w:uiPriority w:val="99"/>
+    <w:unhideWhenUsed/>
+    <w:rsid w:val="00E17704"/>
+    <w:rPr>
+      <w:color w:val="467886" w:themeColor="hyperlink"/>
+      <w:u w:val="single"/>
+    </w:rPr>
+  </w:style>
+  <w:style w:type="character" w:styleId="UnresolvedMention">
+    <w:name w:val="Unresolved Mention"/>
+    <w:basedOn w:val="DefaultParagraphFont"/>
+    <w:uiPriority w:val="99"/>
+    <w:semiHidden/>
+    <w:unhideWhenUsed/>
+    <w:rsid w:val="00E17704"/>
+    <w:rPr>
+      <w:color w:val="605E5C"/>
+      <w:shd w:val="clear" w:color="auto" w:fill="E1DFDD"/>
+    </w:rPr>
+  </w:style>
+  <w:style w:type="character" w:styleId="FollowedHyperlink">
+    <w:name w:val="FollowedHyperlink"/>
+    <w:basedOn w:val="DefaultParagraphFont"/>
+    <w:uiPriority w:val="99"/>
+    <w:semiHidden/>
+    <w:unhideWhenUsed/>
+    <w:rsid w:val="00E17704"/>
+    <w:rPr>
+      <w:color w:val="96607D" w:themeColor="followedHyperlink"/>
+      <w:u w:val="single"/>
+    </w:rPr>
+  </w:style>
 </w:styles>
 </file>
 
@@ -1246,4 +1366,16 @@
     </a:ext>
   </a:extLst>
 </a:theme>
+</file>
+
+<file path=customXml/item1.xml><?xml version="1.0" encoding="utf-8"?>
+<b:Sources xmlns:b="http://schemas.openxmlformats.org/officeDocument/2006/bibliography" xmlns="http://schemas.openxmlformats.org/officeDocument/2006/bibliography" SelectedStyle="/APASixthEditionOfficeOnline.xsl" StyleName="APA" Version="6"/>
+</file>
+
+<file path=customXml/itemProps1.xml><?xml version="1.0" encoding="utf-8"?>
+<ds:datastoreItem xmlns:ds="http://schemas.openxmlformats.org/officeDocument/2006/customXml" ds:itemID="{5AF8B878-CF02-D041-BE04-D5B9EA303ECF}">
+  <ds:schemaRefs>
+    <ds:schemaRef ds:uri="http://schemas.openxmlformats.org/officeDocument/2006/bibliography"/>
+  </ds:schemaRefs>
+</ds:datastoreItem>
 </file>
</xml_diff>